<commit_message>
update: cap nhat file noi quy cong ty 2026 moi voi 19 dieu khoan len he thong va VPS
</commit_message>
<xml_diff>
--- a/NỘI QUY CÔNG TY TNHH TMSX VIỆT Á 2026 (NB).docx
+++ b/NỘI QUY CÔNG TY TNHH TMSX VIỆT Á 2026 (NB).docx
@@ -4195,8 +4195,60 @@
           <w:b/>
           <w:sz w:val="24"/>
           <w:szCs w:val="24"/>
+          <w:highlight w:val="yellow"/>
         </w:rPr>
         <w:t>XV. BẢO MẬT</w:t>
+      </w:r>
+      <w:r>
+        <w:rPr>
+          <w:rFonts w:ascii="Times New Roman" w:hAnsi="Times New Roman" w:cs="Times New Roman"/>
+          <w:b/>
+          <w:sz w:val="24"/>
+          <w:szCs w:val="24"/>
+          <w:highlight w:val="yellow"/>
+        </w:rPr>
+        <w:t xml:space="preserve"> </w:t>
+      </w:r>
+      <w:r>
+        <w:rPr>
+          <w:rFonts w:ascii="Times New Roman" w:hAnsi="Times New Roman" w:cs="Times New Roman"/>
+          <w:b/>
+          <w:sz w:val="24"/>
+          <w:szCs w:val="24"/>
+          <w:highlight w:val="yellow"/>
+        </w:rPr>
+        <w:t>THÔNG TIN NỘI BỘ VÀ QUY ĐỊNH SỬ DỤNG HÌNH ẢNH, THƯƠNG HIỆU TRÊN MẠNG XÃ HỘI</w:t>
+      </w:r>
+    </w:p>
+    <w:p>
+      <w:pPr>
+        <w:pStyle w:val="ListParagraph"/>
+        <w:numPr>
+          <w:ilvl w:val="0"/>
+          <w:numId w:val="32"/>
+        </w:numPr>
+        <w:spacing w:after="40"/>
+        <w:rPr>
+          <w:rFonts w:ascii="Times New Roman" w:hAnsi="Times New Roman" w:cs="Times New Roman"/>
+          <w:b/>
+          <w:bCs/>
+          <w:i/>
+          <w:iCs/>
+          <w:sz w:val="24"/>
+          <w:szCs w:val="24"/>
+        </w:rPr>
+      </w:pPr>
+      <w:r>
+        <w:rPr>
+          <w:rFonts w:ascii="Times New Roman" w:hAnsi="Times New Roman" w:cs="Times New Roman"/>
+          <w:b/>
+          <w:bCs/>
+          <w:i/>
+          <w:iCs/>
+          <w:sz w:val="24"/>
+          <w:szCs w:val="24"/>
+        </w:rPr>
+        <w:t>Bảo mật thông tin nội bộ:</w:t>
       </w:r>
     </w:p>
     <w:p>
@@ -4273,6 +4325,260 @@
     </w:p>
     <w:p>
       <w:pPr>
+        <w:pStyle w:val="ListParagraph"/>
+        <w:numPr>
+          <w:ilvl w:val="0"/>
+          <w:numId w:val="32"/>
+        </w:numPr>
+        <w:spacing w:before="180" w:after="100"/>
+        <w:rPr>
+          <w:rFonts w:ascii="Times New Roman" w:hAnsi="Times New Roman" w:cs="Times New Roman"/>
+          <w:sz w:val="24"/>
+          <w:szCs w:val="24"/>
+        </w:rPr>
+      </w:pPr>
+      <w:r>
+        <w:rPr>
+          <w:rFonts w:ascii="Times New Roman" w:hAnsi="Times New Roman" w:cs="Times New Roman"/>
+          <w:b/>
+          <w:i/>
+          <w:iCs/>
+          <w:sz w:val="24"/>
+          <w:szCs w:val="24"/>
+          <w:highlight w:val="yellow"/>
+        </w:rPr>
+        <w:t>Quy định sử dụng hình ảnh, thương hiệu trên mạng xã hội:</w:t>
+      </w:r>
+    </w:p>
+    <w:p>
+      <w:pPr>
+        <w:pStyle w:val="isselectedend"/>
+        <w:numPr>
+          <w:ilvl w:val="0"/>
+          <w:numId w:val="85"/>
+        </w:numPr>
+        <w:spacing w:before="0" w:beforeAutospacing="0" w:after="0" w:afterAutospacing="0" w:line="276" w:lineRule="auto"/>
+        <w:ind w:left="360"/>
+      </w:pPr>
+      <w:r>
+        <w:t>Người lao động không được tự ý đăng tải, chia sẻ, quảng bá hoặc sử dụng hình ảnh, video, nội dung mang thương hiệu, sản phẩm nệm, gối của các công ty hoặc nhãn hàng cạnh tranh với Nệm Việt Á trên các nền tảng mạng xã hội như TikTok, Facebook, Zalo và các nền tảng tương tự</w:t>
+      </w:r>
+      <w:r>
+        <w:rPr>
+          <w:lang w:val="en-US"/>
+        </w:rPr>
+        <w:t xml:space="preserve"> khác.</w:t>
+      </w:r>
+    </w:p>
+    <w:p>
+      <w:pPr>
+        <w:pStyle w:val="isselectedend"/>
+        <w:numPr>
+          <w:ilvl w:val="0"/>
+          <w:numId w:val="85"/>
+        </w:numPr>
+        <w:spacing w:before="0" w:beforeAutospacing="0" w:after="0" w:afterAutospacing="0" w:line="276" w:lineRule="auto"/>
+        <w:ind w:left="360"/>
+      </w:pPr>
+      <w:r>
+        <w:t xml:space="preserve">Đối với các sản phẩm </w:t>
+      </w:r>
+      <w:r>
+        <w:rPr>
+          <w:b/>
+          <w:bCs/>
+        </w:rPr>
+        <w:t>thương mại</w:t>
+      </w:r>
+      <w:r>
+        <w:t xml:space="preserve"> khác ngoài nhóm sản phẩm nệm, gối</w:t>
+      </w:r>
+      <w:r>
+        <w:rPr>
+          <w:lang w:val="en-US"/>
+        </w:rPr>
+        <w:t xml:space="preserve"> mà công ty sản xuất ra,</w:t>
+      </w:r>
+      <w:r>
+        <w:t xml:space="preserve"> bao gồm</w:t>
+      </w:r>
+      <w:r>
+        <w:rPr>
+          <w:lang w:val="en-US"/>
+        </w:rPr>
+        <w:t xml:space="preserve"> như: </w:t>
+      </w:r>
+      <w:r>
+        <w:t>mùng, mền, drap và các sản phẩm khác</w:t>
+      </w:r>
+      <w:r>
+        <w:rPr>
+          <w:lang w:val="en-US"/>
+        </w:rPr>
+        <w:t>. N</w:t>
+      </w:r>
+      <w:r>
+        <w:t>gười lao động được phép đăng tải, chia sẻ, quảng bá bình thường, với điều kiện nội dung không vi phạm pháp luật, không tiết lộ thông tin mật và không gây ảnh hưởng xấu đến uy tín, hình ảnh của Công ty.</w:t>
+      </w:r>
+    </w:p>
+    <w:p>
+      <w:pPr>
+        <w:pStyle w:val="Heading3"/>
+        <w:numPr>
+          <w:ilvl w:val="0"/>
+          <w:numId w:val="32"/>
+        </w:numPr>
+        <w:spacing w:before="0"/>
+        <w:rPr>
+          <w:rFonts w:ascii="Times New Roman" w:eastAsiaTheme="minorEastAsia" w:hAnsi="Times New Roman" w:cs="Times New Roman"/>
+          <w:i/>
+          <w:iCs/>
+          <w:color w:val="auto"/>
+          <w:sz w:val="24"/>
+          <w:szCs w:val="24"/>
+          <w:highlight w:val="yellow"/>
+        </w:rPr>
+      </w:pPr>
+      <w:r>
+        <w:rPr>
+          <w:rFonts w:ascii="Times New Roman" w:eastAsiaTheme="minorEastAsia" w:hAnsi="Times New Roman" w:cs="Times New Roman"/>
+          <w:i/>
+          <w:iCs/>
+          <w:color w:val="auto"/>
+          <w:sz w:val="24"/>
+          <w:szCs w:val="24"/>
+          <w:highlight w:val="yellow"/>
+        </w:rPr>
+        <w:t>Xử lý vi phạm</w:t>
+      </w:r>
+      <w:r>
+        <w:rPr>
+          <w:rFonts w:ascii="Times New Roman" w:eastAsiaTheme="minorEastAsia" w:hAnsi="Times New Roman" w:cs="Times New Roman"/>
+          <w:i/>
+          <w:iCs/>
+          <w:color w:val="auto"/>
+          <w:sz w:val="24"/>
+          <w:szCs w:val="24"/>
+          <w:highlight w:val="yellow"/>
+        </w:rPr>
+        <w:t xml:space="preserve">: </w:t>
+      </w:r>
+    </w:p>
+    <w:p>
+      <w:pPr>
+        <w:pStyle w:val="isselectedend"/>
+        <w:spacing w:before="0" w:beforeAutospacing="0" w:after="0" w:afterAutospacing="0" w:line="276" w:lineRule="auto"/>
+        <w:ind w:left="360" w:hanging="360"/>
+      </w:pPr>
+      <w:r>
+        <w:rPr>
+          <w:lang w:val="en-US"/>
+        </w:rPr>
+        <w:t xml:space="preserve">-    </w:t>
+      </w:r>
+      <w:r>
+        <w:t>Người lao động vi phạm các quy định tại Điều này sẽ bị xem xét, xử lý căn cứ vào tính chất, mức độ, hậu quả, lỗi vi phạm và các quy định hiện hành, cụ thể:</w:t>
+      </w:r>
+    </w:p>
+    <w:p>
+      <w:pPr>
+        <w:pStyle w:val="isselectedend"/>
+        <w:spacing w:before="0" w:beforeAutospacing="0" w:after="0" w:afterAutospacing="0" w:line="276" w:lineRule="auto"/>
+        <w:ind w:left="360"/>
+        <w:rPr>
+          <w:lang w:val="en-US"/>
+        </w:rPr>
+      </w:pPr>
+      <w:r>
+        <w:t xml:space="preserve">a) </w:t>
+      </w:r>
+      <w:r>
+        <w:rPr>
+          <w:rStyle w:val="Strong"/>
+        </w:rPr>
+        <w:t>Về tiền thưởng:</w:t>
+      </w:r>
+      <w:r>
+        <w:t xml:space="preserve"> </w:t>
+      </w:r>
+      <w:r>
+        <w:rPr>
+          <w:lang w:val="en-US"/>
+        </w:rPr>
+        <w:t>Sẽ cắt toàn bộ tiền</w:t>
+      </w:r>
+      <w:r>
+        <w:t xml:space="preserve"> thưởng tháng, thưởng hiệu quả công việc và các khoản thưởng khác được thực hiện theo quy chế thưởng của Công ty đã ban hành</w:t>
+      </w:r>
+      <w:r>
+        <w:rPr>
+          <w:lang w:val="en-US"/>
+        </w:rPr>
+        <w:t>.</w:t>
+      </w:r>
+    </w:p>
+    <w:p>
+      <w:pPr>
+        <w:pStyle w:val="isselectedend"/>
+        <w:spacing w:before="0" w:beforeAutospacing="0" w:line="276" w:lineRule="auto"/>
+        <w:ind w:left="360"/>
+        <w:rPr>
+          <w:lang w:val="en-US"/>
+        </w:rPr>
+      </w:pPr>
+      <w:r>
+        <w:t xml:space="preserve">b) </w:t>
+      </w:r>
+      <w:r>
+        <w:rPr>
+          <w:rStyle w:val="Strong"/>
+        </w:rPr>
+        <w:t>Về xét tăng lương:</w:t>
+      </w:r>
+      <w:r>
+        <w:t xml:space="preserve"> Người lao động vi phạm </w:t>
+      </w:r>
+      <w:r>
+        <w:rPr>
+          <w:lang w:val="en-US"/>
+        </w:rPr>
+        <w:t>sẽ không được xem xét tăng lương tầng, bậc… trong vòng 12 tháng.</w:t>
+      </w:r>
+    </w:p>
+    <w:p>
+      <w:pPr>
+        <w:pStyle w:val="isselectedend"/>
+        <w:spacing w:before="0" w:beforeAutospacing="0" w:line="276" w:lineRule="auto"/>
+        <w:ind w:left="360"/>
+        <w:rPr>
+          <w:lang w:val="en-US"/>
+        </w:rPr>
+      </w:pPr>
+      <w:r>
+        <w:lastRenderedPageBreak/>
+        <w:t xml:space="preserve">c) </w:t>
+      </w:r>
+      <w:r>
+        <w:rPr>
+          <w:rStyle w:val="Strong"/>
+        </w:rPr>
+        <w:t>Về bồi thường thiệt hại:</w:t>
+      </w:r>
+      <w:r>
+        <w:t xml:space="preserve"> Trường hợp hành vi vi phạm gây thiệt hại thực tế cho Công ty, người lao động có trách nhiệm bồi thường nếu có đủ căn cứ xác định trách nhiệm, mức thiệt hại và các điều kiện liên quan theo quy đị</w:t>
+      </w:r>
+      <w:r>
+        <w:rPr>
+          <w:lang w:val="en-US"/>
+        </w:rPr>
+        <w:t>nh của công ty</w:t>
+      </w:r>
+      <w:r>
+        <w:t>.</w:t>
+      </w:r>
+    </w:p>
+    <w:p>
+      <w:pPr>
         <w:spacing w:before="180" w:after="100"/>
         <w:rPr>
           <w:rFonts w:ascii="Times New Roman" w:hAnsi="Times New Roman" w:cs="Times New Roman"/>
@@ -4567,26 +4873,6 @@
     </w:p>
     <w:p>
       <w:pPr>
-        <w:spacing w:after="40"/>
-        <w:rPr>
-          <w:rFonts w:ascii="Times New Roman" w:hAnsi="Times New Roman" w:cs="Times New Roman"/>
-          <w:sz w:val="24"/>
-          <w:szCs w:val="24"/>
-        </w:rPr>
-      </w:pPr>
-    </w:p>
-    <w:p>
-      <w:pPr>
-        <w:spacing w:after="40"/>
-        <w:rPr>
-          <w:rFonts w:ascii="Times New Roman" w:hAnsi="Times New Roman" w:cs="Times New Roman"/>
-          <w:sz w:val="24"/>
-          <w:szCs w:val="24"/>
-        </w:rPr>
-      </w:pPr>
-    </w:p>
-    <w:p>
-      <w:pPr>
         <w:spacing w:before="180" w:after="100"/>
         <w:rPr>
           <w:rFonts w:ascii="Times New Roman" w:hAnsi="Times New Roman" w:cs="Times New Roman"/>
@@ -4601,7 +4887,6 @@
           <w:sz w:val="24"/>
           <w:szCs w:val="24"/>
         </w:rPr>
-        <w:lastRenderedPageBreak/>
         <w:t xml:space="preserve">XVIII. VI PHẠM </w:t>
       </w:r>
       <w:r>
@@ -4896,6 +5181,16 @@
           <w:szCs w:val="24"/>
         </w:rPr>
       </w:pPr>
+    </w:p>
+    <w:p>
+      <w:pPr>
+        <w:spacing w:before="180" w:after="100"/>
+        <w:rPr>
+          <w:rFonts w:ascii="Times New Roman" w:hAnsi="Times New Roman" w:cs="Times New Roman"/>
+          <w:sz w:val="24"/>
+          <w:szCs w:val="24"/>
+        </w:rPr>
+      </w:pPr>
       <w:r>
         <w:rPr>
           <w:rFonts w:ascii="Times New Roman" w:hAnsi="Times New Roman" w:cs="Times New Roman"/>
@@ -5081,15 +5376,7 @@
           <w:sz w:val="24"/>
           <w:szCs w:val="24"/>
         </w:rPr>
-        <w:t xml:space="preserve"> trước đây có nội dung khác với Chính sách này</w:t>
-      </w:r>
-      <w:r>
-        <w:rPr>
-          <w:rFonts w:ascii="Times New Roman" w:hAnsi="Times New Roman" w:cs="Times New Roman"/>
-          <w:sz w:val="24"/>
-          <w:szCs w:val="24"/>
-        </w:rPr>
-        <w:t>.</w:t>
+        <w:t xml:space="preserve"> trước đây có nội dung khác với Chính sách này.</w:t>
       </w:r>
       <w:r>
         <w:rPr>
@@ -5276,6 +5563,7 @@
                 <w:sz w:val="24"/>
                 <w:szCs w:val="24"/>
               </w:rPr>
+              <w:lastRenderedPageBreak/>
               <w:t>Phòng nhân sự;</w:t>
             </w:r>
           </w:p>
@@ -5410,6 +5698,7 @@
                 <w:sz w:val="24"/>
                 <w:szCs w:val="24"/>
               </w:rPr>
+              <w:lastRenderedPageBreak/>
               <w:t>ĐẠI DIỆN CÔNG TY</w:t>
             </w:r>
           </w:p>
@@ -6007,7 +6296,7 @@
         <v:path o:extrusionok="f" gradientshapeok="t" o:connecttype="rect"/>
         <o:lock v:ext="edit" aspectratio="t"/>
       </v:shapetype>
-      <v:shape id="_x0000_i1045" type="#_x0000_t75" style="width:10.8pt;height:10.8pt" o:bullet="t">
+      <v:shape id="_x0000_i1106" type="#_x0000_t75" style="width:11.05pt;height:11.05pt" o:bullet="t">
         <v:imagedata r:id="rId1" o:title="msoB1DA"/>
       </v:shape>
     </w:pict>
@@ -12770,7 +13059,7 @@
   <w:abstractNum w:abstractNumId="65" w15:restartNumberingAfterBreak="0">
     <w:nsid w:val="49895E35"/>
     <w:multiLevelType w:val="hybridMultilevel"/>
-    <w:tmpl w:val="90E8B864"/>
+    <w:tmpl w:val="DCC4EF7E"/>
     <w:lvl w:ilvl="0" w:tplc="0409000B">
       <w:start w:val="1"/>
       <w:numFmt w:val="bullet"/>
@@ -17046,7 +17335,7 @@
   <w:style w:type="paragraph" w:default="1" w:styleId="Normal">
     <w:name w:val="Normal"/>
     <w:qFormat/>
-    <w:rsid w:val="008F3D4B"/>
+    <w:rsid w:val="00DB3582"/>
     <w:pPr>
       <w:spacing w:after="80"/>
     </w:pPr>
@@ -17267,7 +17556,6 @@
   <w:style w:type="character" w:default="1" w:styleId="DefaultParagraphFont">
     <w:name w:val="Default Paragraph Font"/>
     <w:uiPriority w:val="1"/>
-    <w:semiHidden/>
     <w:unhideWhenUsed/>
   </w:style>
   <w:style w:type="table" w:default="1" w:styleId="TableNormal">
@@ -28044,6 +28332,37 @@
       </w:tcPr>
     </w:tblStylePr>
   </w:style>
+  <w:style w:type="paragraph" w:customStyle="1" w:styleId="isselectedend">
+    <w:name w:val="isselectedend"/>
+    <w:basedOn w:val="Normal"/>
+    <w:rsid w:val="004D5A90"/>
+    <w:pPr>
+      <w:spacing w:before="100" w:beforeAutospacing="1" w:after="100" w:afterAutospacing="1" w:line="240" w:lineRule="auto"/>
+    </w:pPr>
+    <w:rPr>
+      <w:rFonts w:ascii="Times New Roman" w:eastAsia="Times New Roman" w:hAnsi="Times New Roman" w:cs="Times New Roman"/>
+      <w:sz w:val="24"/>
+      <w:szCs w:val="24"/>
+      <w:lang w:val="vi-VN" w:eastAsia="vi-VN"/>
+    </w:rPr>
+  </w:style>
+  <w:style w:type="paragraph" w:styleId="NormalWeb">
+    <w:name w:val="Normal (Web)"/>
+    <w:basedOn w:val="Normal"/>
+    <w:uiPriority w:val="99"/>
+    <w:semiHidden/>
+    <w:unhideWhenUsed/>
+    <w:rsid w:val="004D5A90"/>
+    <w:pPr>
+      <w:spacing w:before="100" w:beforeAutospacing="1" w:after="100" w:afterAutospacing="1" w:line="240" w:lineRule="auto"/>
+    </w:pPr>
+    <w:rPr>
+      <w:rFonts w:ascii="Times New Roman" w:eastAsia="Times New Roman" w:hAnsi="Times New Roman" w:cs="Times New Roman"/>
+      <w:sz w:val="24"/>
+      <w:szCs w:val="24"/>
+      <w:lang w:val="vi-VN" w:eastAsia="vi-VN"/>
+    </w:rPr>
+  </w:style>
 </w:styles>
 </file>
 

</xml_diff>